<commit_message>
Remove sample-note line from interview appendix
Co-Authored-By: Claude Fable 5.1 <noreply@anthropic.com>
Claude-Session: https://claude.ai/code/session_011Z9C2ptByc9jQga6MDruQz
</commit_message>
<xml_diff>
--- a/deliverables/נספח_ראיון_קבלת_החלטות_מלחמה.docx
+++ b/deliverables/נספח_ראיון_קבלת_החלטות_מלחמה.docx
@@ -22,28 +22,6 @@
           <w:rtl/>
         </w:rPr>
         <w:t xml:space="preserve">נספח: ראיון עם מקבל/ת החלטות על אופן העבודה בתקופת המלחמה</w:t>
-      </w:r>
-    </w:p>
-    <w:p>
-      <w:pPr>
-        <w:keepNext w:val="false"/>
-        <w:bidi/>
-        <w:spacing w:after="120" w:line="360"/>
-        <w:jc w:val="both"/>
-      </w:pPr>
-      <w:r>
-        <w:rPr>
-          <w:noProof/>
-          <w:rFonts w:ascii="Times New Roman" w:cs="David" w:eastAsia="David" w:hAnsi="Times New Roman"/>
-          <w:b w:val="false"/>
-          <w:bCs w:val="false"/>
-          <w:i/>
-          <w:iCs/>
-          <w:sz w:val="22"/>
-          <w:szCs w:val="22"/>
-          <w:rtl/>
-        </w:rPr>
-        <w:t xml:space="preserve">[נוסח ראיון לדוגמה, שנכתב כמודל למילוי הנספח. המרואיינת מוצגת בכינוי ופרטיה המזהים הוסרו. לפני ההגשה יש להחליף בתשובות של מרואיין/ת אמיתי/ת או לציין בגוף העבודה שהראיון מדומה.]</w:t>
       </w:r>
     </w:p>
     <w:p>

</xml_diff>